<commit_message>
Add authentication and persistent database support
</commit_message>
<xml_diff>
--- a/IntelliReport_AI_Project_Synopsis.docx
+++ b/IntelliReport_AI_Project_Synopsis.docx
@@ -1997,7 +1997,7 @@
     <w:p>
       <w:r>
         <w:pict w14:anchorId="43494DE5">
-          <v:rect id="_x0000_i1084" style="width:0;height:1.5pt" o:hralign="center" o:hrstd="t" o:hr="t" fillcolor="#a0a0a0" stroked="f"/>
+          <v:rect id="_x0000_i1027" style="width:0;height:1.5pt" o:hralign="center" o:hrstd="t" o:hr="t" fillcolor="#a0a0a0" stroked="f"/>
         </w:pict>
       </w:r>
     </w:p>
@@ -2033,10 +2033,13 @@
         <w:tab/>
       </w:r>
       <w:r>
+        <w:rPr>
+          <w:noProof/>
+        </w:rPr>
         <w:drawing>
-          <wp:inline distT="0" distB="0" distL="0" distR="0" wp14:anchorId="6C0C6CCA" wp14:editId="73631D4F">
-            <wp:extent cx="3107690" cy="3388037"/>
-            <wp:effectExtent l="0" t="0" r="0" b="3175"/>
+          <wp:inline distT="0" distB="0" distL="0" distR="0" wp14:anchorId="6C0C6CCA" wp14:editId="74541B87">
+            <wp:extent cx="2806861" cy="3422004"/>
+            <wp:effectExtent l="0" t="0" r="0" b="7620"/>
             <wp:docPr id="635261117" name="Picture 1"/>
             <wp:cNvGraphicFramePr>
               <a:graphicFrameLocks xmlns:a="http://schemas.openxmlformats.org/drawingml/2006/main" noChangeAspect="1"/>
@@ -2057,7 +2060,7 @@
                   <pic:spPr>
                     <a:xfrm>
                       <a:off x="0" y="0"/>
-                      <a:ext cx="3147691" cy="3431646"/>
+                      <a:ext cx="2875496" cy="3505680"/>
                     </a:xfrm>
                     <a:prstGeom prst="rect">
                       <a:avLst/>
@@ -3095,7 +3098,7 @@
     <w:p>
       <w:r>
         <w:pict w14:anchorId="7BF52C1D">
-          <v:rect id="_x0000_i1632" style="width:0;height:1.5pt" o:hralign="center" o:hrstd="t" o:hr="t" fillcolor="#a0a0a0" stroked="f"/>
+          <v:rect id="_x0000_i1033" style="width:0;height:1.5pt" o:hralign="center" o:hrstd="t" o:hr="t" fillcolor="#a0a0a0" stroked="f"/>
         </w:pict>
       </w:r>
     </w:p>
@@ -3118,7 +3121,7 @@
     <w:p>
       <w:r>
         <w:pict w14:anchorId="07AA5052">
-          <v:rect id="_x0000_i1615" style="width:0;height:1.5pt" o:hralign="center" o:hrstd="t" o:hr="t" fillcolor="#a0a0a0" stroked="f"/>
+          <v:rect id="_x0000_i1034" style="width:0;height:1.5pt" o:hralign="center" o:hrstd="t" o:hr="t" fillcolor="#a0a0a0" stroked="f"/>
         </w:pict>
       </w:r>
     </w:p>
@@ -3141,7 +3144,7 @@
     <w:p>
       <w:r>
         <w:pict w14:anchorId="2BD81B81">
-          <v:rect id="_x0000_i1616" style="width:0;height:1.5pt" o:hralign="center" o:hrstd="t" o:hr="t" fillcolor="#a0a0a0" stroked="f"/>
+          <v:rect id="_x0000_i1035" style="width:0;height:1.5pt" o:hralign="center" o:hrstd="t" o:hr="t" fillcolor="#a0a0a0" stroked="f"/>
         </w:pict>
       </w:r>
     </w:p>
@@ -3164,7 +3167,7 @@
     <w:p>
       <w:r>
         <w:pict w14:anchorId="1CA3E2CE">
-          <v:rect id="_x0000_i1617" style="width:0;height:1.5pt" o:hralign="center" o:hrstd="t" o:hr="t" fillcolor="#a0a0a0" stroked="f"/>
+          <v:rect id="_x0000_i1036" style="width:0;height:1.5pt" o:hralign="center" o:hrstd="t" o:hr="t" fillcolor="#a0a0a0" stroked="f"/>
         </w:pict>
       </w:r>
     </w:p>
@@ -3187,7 +3190,7 @@
     <w:p>
       <w:r>
         <w:pict w14:anchorId="5640C27D">
-          <v:rect id="_x0000_i1618" style="width:0;height:1.5pt" o:hralign="center" o:hrstd="t" o:hr="t" fillcolor="#a0a0a0" stroked="f"/>
+          <v:rect id="_x0000_i1037" style="width:0;height:1.5pt" o:hralign="center" o:hrstd="t" o:hr="t" fillcolor="#a0a0a0" stroked="f"/>
         </w:pict>
       </w:r>
     </w:p>
@@ -3210,7 +3213,7 @@
     <w:p>
       <w:r>
         <w:pict w14:anchorId="0D722475">
-          <v:rect id="_x0000_i1619" style="width:0;height:1.5pt" o:hralign="center" o:hrstd="t" o:hr="t" fillcolor="#a0a0a0" stroked="f"/>
+          <v:rect id="_x0000_i1038" style="width:0;height:1.5pt" o:hralign="center" o:hrstd="t" o:hr="t" fillcolor="#a0a0a0" stroked="f"/>
         </w:pict>
       </w:r>
     </w:p>
@@ -3234,7 +3237,7 @@
       <w:r>
         <w:lastRenderedPageBreak/>
         <w:pict w14:anchorId="6EED5752">
-          <v:rect id="_x0000_i1620" style="width:0;height:1.5pt" o:hralign="center" o:hrstd="t" o:hr="t" fillcolor="#a0a0a0" stroked="f"/>
+          <v:rect id="_x0000_i1039" style="width:0;height:1.5pt" o:hralign="center" o:hrstd="t" o:hr="t" fillcolor="#a0a0a0" stroked="f"/>
         </w:pict>
       </w:r>
     </w:p>
@@ -3257,7 +3260,7 @@
     <w:p>
       <w:r>
         <w:pict w14:anchorId="223BD52F">
-          <v:rect id="_x0000_i1621" style="width:0;height:1.5pt" o:hralign="center" o:hrstd="t" o:hr="t" fillcolor="#a0a0a0" stroked="f"/>
+          <v:rect id="_x0000_i1040" style="width:0;height:1.5pt" o:hralign="center" o:hrstd="t" o:hr="t" fillcolor="#a0a0a0" stroked="f"/>
         </w:pict>
       </w:r>
     </w:p>
@@ -3280,7 +3283,7 @@
     <w:p>
       <w:r>
         <w:pict w14:anchorId="2D3E2271">
-          <v:rect id="_x0000_i1033" style="width:0;height:1.5pt" o:hralign="center" o:hrstd="t" o:hr="t" fillcolor="#a0a0a0" stroked="f"/>
+          <v:rect id="_x0000_i1041" style="width:0;height:1.5pt" o:hralign="center" o:hrstd="t" o:hr="t" fillcolor="#a0a0a0" stroked="f"/>
         </w:pict>
       </w:r>
     </w:p>
@@ -3678,7 +3681,7 @@
     <w:p>
       <w:r>
         <w:pict w14:anchorId="43BC0F2F">
-          <v:rect id="_x0000_i1034" style="width:0;height:1.5pt" o:hralign="center" o:hrstd="t" o:hr="t" fillcolor="#a0a0a0" stroked="f"/>
+          <v:rect id="_x0000_i1042" style="width:0;height:1.5pt" o:hralign="center" o:hrstd="t" o:hr="t" fillcolor="#a0a0a0" stroked="f"/>
         </w:pict>
       </w:r>
     </w:p>
@@ -5087,6 +5090,7 @@
   <w:style w:type="character" w:default="1" w:styleId="DefaultParagraphFont">
     <w:name w:val="Default Paragraph Font"/>
     <w:uiPriority w:val="1"/>
+    <w:semiHidden/>
     <w:unhideWhenUsed/>
   </w:style>
   <w:style w:type="table" w:default="1" w:styleId="TableNormal">

</xml_diff>